<commit_message>
Fixed folder structure and added devops doc
</commit_message>
<xml_diff>
--- a/June8th/PySpark RDD.docx
+++ b/June8th/PySpark RDD.docx
@@ -137,19 +137,7 @@
           <w:rPr>
             <w:rStyle w:val="Hyperlink"/>
           </w:rPr>
-          <w:t>https://medium.com/@swayampravapanda686/unders</w:t>
-        </w:r>
-        <w:r>
-          <w:rPr>
-            <w:rStyle w:val="Hyperlink"/>
-          </w:rPr>
-          <w:t>t</w:t>
-        </w:r>
-        <w:r>
-          <w:rPr>
-            <w:rStyle w:val="Hyperlink"/>
-          </w:rPr>
-          <w:t>anding-rdds-in-spark-2cad34fea400</w:t>
+          <w:t>https://medium.com/@swayampravapanda686/understanding-rdds-in-spark-2cad34fea400</w:t>
         </w:r>
       </w:hyperlink>
     </w:p>
@@ -302,6 +290,46 @@
       <w:proofErr w:type="gramEnd"/>
       <w:r>
         <w:t xml:space="preserve">)). </w:t>
+      </w:r>
+    </w:p>
+    <w:p>
+      <w:r>
+        <w:lastRenderedPageBreak/>
+        <w:drawing>
+          <wp:inline distT="0" distB="0" distL="0" distR="0" wp14:anchorId="554C0BB9" wp14:editId="616AA36D">
+            <wp:extent cx="3330229" cy="4016088"/>
+            <wp:effectExtent l="0" t="0" r="3810" b="3810"/>
+            <wp:docPr id="1877421511" name="Picture 1"/>
+            <wp:cNvGraphicFramePr>
+              <a:graphicFrameLocks xmlns:a="http://schemas.openxmlformats.org/drawingml/2006/main" noChangeAspect="1"/>
+            </wp:cNvGraphicFramePr>
+            <a:graphic xmlns:a="http://schemas.openxmlformats.org/drawingml/2006/main">
+              <a:graphicData uri="http://schemas.openxmlformats.org/drawingml/2006/picture">
+                <pic:pic xmlns:pic="http://schemas.openxmlformats.org/drawingml/2006/picture">
+                  <pic:nvPicPr>
+                    <pic:cNvPr id="1877421511" name=""/>
+                    <pic:cNvPicPr/>
+                  </pic:nvPicPr>
+                  <pic:blipFill>
+                    <a:blip r:embed="rId5"/>
+                    <a:stretch>
+                      <a:fillRect/>
+                    </a:stretch>
+                  </pic:blipFill>
+                  <pic:spPr>
+                    <a:xfrm>
+                      <a:off x="0" y="0"/>
+                      <a:ext cx="3330229" cy="4016088"/>
+                    </a:xfrm>
+                    <a:prstGeom prst="rect">
+                      <a:avLst/>
+                    </a:prstGeom>
+                  </pic:spPr>
+                </pic:pic>
+              </a:graphicData>
+            </a:graphic>
+          </wp:inline>
+        </w:drawing>
       </w:r>
     </w:p>
     <w:sectPr>
@@ -917,6 +945,7 @@
   <w:style w:type="character" w:default="1" w:styleId="DefaultParagraphFont">
     <w:name w:val="Default Paragraph Font"/>
     <w:uiPriority w:val="1"/>
+    <w:semiHidden/>
     <w:unhideWhenUsed/>
   </w:style>
   <w:style w:type="table" w:default="1" w:styleId="TableNormal">

</xml_diff>